<commit_message>
feat(core): separate frame updates from 50 Hz fixed simulation
Run gameplay and combat animation on configurable fixed ticks while keeping
component Update callbacks and rendering on the frame loop. Buffer input
edges until the next tick, cap catch-up at eight steps, and clear accumulated
time across pause, focus, scene, and play-mode transitions.

Process contacts and queued events before fixed-tick destruction. Keep frame
clock views separate from fixed deltas and migrate movement/model callbacks.
Update implementation notes and planning documents to the agreed 50 Hz rate.

Validation: Debug and Release builds; all eight verification modes per
configuration, including callback cadence, input consumption, and deletion.
DOCX text-only OOXML preservation checked; visual rendering unavailable
because LibreOffice is not installed.
</commit_message>
<xml_diff>
--- a/기획/Nereides_Engine_기술검토서_v1.6_상세규칙.docx
+++ b/기획/Nereides_Engine_기술검토서_v1.6_상세규칙.docx
@@ -547,7 +547,7 @@
                 <w:sz w:val="17"/>
                 <w:szCs w:val="17"/>
               </w:rPr>
-              <w:t>게임 로직 고정 tick 60</w:t>
+              <w:t>게임 로직 고정 tick 50</w:t>
             </w:r>
             <w:proofErr w:type="gramStart"/>
             <w:r>
@@ -2464,7 +2464,7 @@
                 <w:sz w:val="17"/>
                 <w:szCs w:val="17"/>
               </w:rPr>
-              <w:t xml:space="preserve">게임 창과 DX11 초기화, 고정 tick 60Hz 게임 루프와 프레임마다의 </w:t>
+              <w:t xml:space="preserve">게임 창과 DX11 초기화, 고정 tick 50Hz 게임 루프와 프레임마다의 </w:t>
             </w:r>
             <w:proofErr w:type="spellStart"/>
             <w:r>
@@ -3525,7 +3525,7 @@
         <w:spacing w:after="120" w:line="300" w:lineRule="auto"/>
       </w:pPr>
       <w:r>
-        <w:t xml:space="preserve">게임 로직·충돌·애니메이션·전투 타이머는 1/60초 고정 tick으로 진행하고, </w:t>
+        <w:t xml:space="preserve">게임 로직·충돌·애니메이션·전투 타이머는 1/50초 고정 tick으로 진행하고, </w:t>
       </w:r>
       <w:proofErr w:type="spellStart"/>
       <w:r>
@@ -3533,7 +3533,7 @@
       </w:r>
       <w:proofErr w:type="spellEnd"/>
       <w:r>
-        <w:t xml:space="preserve"> 프레임마다 한 번 수행한다. 프레임이 길어지면 밀린 tick을 여러 번 실행하되 프레임당 최대 실행 수를 제한해 지연이 누적되지 않게 한다. 최대값은 측정 후 정한다. </w:t>
+        <w:t xml:space="preserve"> 프레임마다 한 번 수행한다. 프레임이 길어지면 밀린 tick을 여러 번 실행하되 프레임당 최대 실행 수를 제한해 지연이 누적되지 않게 한다. 초기 최대값은 프레임당 8회로 두고 실측 후 조정한다. 한도를 넘는 완전한 tick 시간은 버리고 남은 소수 시간만 보관한다. </w:t>
       </w:r>
       <w:proofErr w:type="spellStart"/>
       <w:r>
@@ -17376,7 +17376,7 @@
         <w:spacing w:after="120" w:line="300" w:lineRule="auto"/>
       </w:pPr>
       <w:r>
-        <w:t xml:space="preserve">길이·각도 단위, 위쪽 축·앞 방향, 행렬 순서와 모델 스케일을 합의한다. 게임 시간은 고정 tick 60Hz로 진행한다. 데이터의 시간 값은 초 단위로 적고 실행 시 tick으로 변환하는 안을 제안하며, 변환 규칙은 WE01에서 정한다. D08에 따라 전투·탈출·연출 시간을 구분한다. 2D 전환은 전투 시간을 멈추며 탈출 타이머는 일시정지에서 멈추고 </w:t>
+        <w:t xml:space="preserve">길이·각도 단위, 위쪽 축·앞 방향, 행렬 순서와 모델 스케일을 합의한다. 게임 시간은 고정 tick 50Hz로 진행한다. 데이터의 시간 값은 초 단위로 적고 실행 시 tick으로 변환하는 안을 제안하며, 변환 규칙은 WE01에서 정한다. D08에 따라 전투·탈출·연출 시간을 구분한다. 2D 전환은 전투 시간을 멈추며 탈출 타이머는 일시정지에서 멈추고 </w:t>
       </w:r>
       <w:proofErr w:type="spellStart"/>
       <w:r>
@@ -20180,7 +20180,7 @@
                 <w:sz w:val="17"/>
                 <w:szCs w:val="17"/>
               </w:rPr>
-              <w:t xml:space="preserve">게임 로직 고정 tick 60Hz, </w:t>
+              <w:t xml:space="preserve">게임 로직 고정 tick 50Hz, </w:t>
             </w:r>
             <w:proofErr w:type="spellStart"/>
             <w:r>

</xml_diff>